<commit_message>
Corrige el ancho de las columnas en los Word y los PDF
- Word: cada columna recibe al menos el ancho de su palabra más larga y el
  espacio restante se reparte según el contenido; las tablas de 6 o más
  columnas usan márgenes de celda angostos y letra de hasta 7 puntos antes
  de partir palabras. Ninguna celda queda con una palabra más ancha que
  su columna; los 22 Word pasan la validación de esquema.
- PDF: se quitó el corte forzado de palabras (partía "Comprensión" en la
  columna NIVEL); solo se cortan URLs y código. Las URLs sueltas se
  convierten en enlaces, los folios con guion no se parten y las tablas
  anchas usan letra un poco menor. El generador comprueba que nada exceda
  el ancho de la hoja y que cada palabra quepa en su columna.

Co-Authored-By: Claude Opus 5.5 <noreply@anthropic.com>
</commit_message>
<xml_diff>
--- a/Word/00-indice-familia-estandares.docx
+++ b/Word/00-indice-familia-estandares.docx
@@ -50,9 +50,9 @@
         <w:tblLook w:firstColumn="1" w:firstRow="1" w:lastColumn="0" w:lastRow="0" w:noHBand="0" w:noVBand="1" w:val="04A0"/>
       </w:tblPr>
       <w:tblGrid>
-        <w:gridCol w:w="2361"/>
-        <w:gridCol w:w="5556"/>
-        <w:gridCol w:w="1713"/>
+        <w:gridCol w:w="3363"/>
+        <w:gridCol w:w="4315"/>
+        <w:gridCol w:w="1952"/>
       </w:tblGrid>
       <w:tr>
         <w:trPr>
@@ -61,7 +61,7 @@
         </w:trPr>
         <w:tc>
           <w:tcPr>
-            <w:tcW w:w="2361" w:type="dxa"/>
+            <w:tcW w:w="3363" w:type="dxa"/>
             <w:shd w:val="clear" w:color="auto" w:fill="ECECEC"/>
           </w:tcPr>
           <w:p>
@@ -80,7 +80,7 @@
         </w:tc>
         <w:tc>
           <w:tcPr>
-            <w:tcW w:w="5556" w:type="dxa"/>
+            <w:tcW w:w="4315" w:type="dxa"/>
             <w:shd w:val="clear" w:color="auto" w:fill="ECECEC"/>
           </w:tcPr>
           <w:p>
@@ -99,7 +99,7 @@
         </w:tc>
         <w:tc>
           <w:tcPr>
-            <w:tcW w:w="1713" w:type="dxa"/>
+            <w:tcW w:w="1952" w:type="dxa"/>
             <w:shd w:val="clear" w:color="auto" w:fill="ECECEC"/>
           </w:tcPr>
           <w:p>
@@ -120,7 +120,7 @@
       <w:tr>
         <w:tc>
           <w:tcPr>
-            <w:tcW w:w="2361" w:type="dxa"/>
+            <w:tcW w:w="3363" w:type="dxa"/>
           </w:tcPr>
           <w:p>
             <w:pPr>
@@ -159,7 +159,7 @@
         </w:tc>
         <w:tc>
           <w:tcPr>
-            <w:tcW w:w="5556" w:type="dxa"/>
+            <w:tcW w:w="4315" w:type="dxa"/>
           </w:tcPr>
           <w:p>
             <w:pPr>
@@ -176,7 +176,7 @@
         </w:tc>
         <w:tc>
           <w:tcPr>
-            <w:tcW w:w="1713" w:type="dxa"/>
+            <w:tcW w:w="1952" w:type="dxa"/>
           </w:tcPr>
           <w:p>
             <w:pPr>
@@ -195,7 +195,7 @@
       <w:tr>
         <w:tc>
           <w:tcPr>
-            <w:tcW w:w="2361" w:type="dxa"/>
+            <w:tcW w:w="3363" w:type="dxa"/>
           </w:tcPr>
           <w:p>
             <w:pPr>
@@ -213,7 +213,7 @@
         </w:tc>
         <w:tc>
           <w:tcPr>
-            <w:tcW w:w="5556" w:type="dxa"/>
+            <w:tcW w:w="4315" w:type="dxa"/>
           </w:tcPr>
           <w:p>
             <w:pPr>
@@ -230,7 +230,7 @@
         </w:tc>
         <w:tc>
           <w:tcPr>
-            <w:tcW w:w="1713" w:type="dxa"/>
+            <w:tcW w:w="1952" w:type="dxa"/>
           </w:tcPr>
           <w:p>
             <w:pPr>
@@ -249,7 +249,7 @@
       <w:tr>
         <w:tc>
           <w:tcPr>
-            <w:tcW w:w="2361" w:type="dxa"/>
+            <w:tcW w:w="3363" w:type="dxa"/>
           </w:tcPr>
           <w:p>
             <w:pPr>
@@ -267,7 +267,7 @@
         </w:tc>
         <w:tc>
           <w:tcPr>
-            <w:tcW w:w="5556" w:type="dxa"/>
+            <w:tcW w:w="4315" w:type="dxa"/>
           </w:tcPr>
           <w:p>
             <w:pPr>
@@ -291,7 +291,7 @@
         </w:tc>
         <w:tc>
           <w:tcPr>
-            <w:tcW w:w="1713" w:type="dxa"/>
+            <w:tcW w:w="1952" w:type="dxa"/>
           </w:tcPr>
           <w:p>
             <w:pPr>
@@ -310,7 +310,7 @@
       <w:tr>
         <w:tc>
           <w:tcPr>
-            <w:tcW w:w="2361" w:type="dxa"/>
+            <w:tcW w:w="3363" w:type="dxa"/>
           </w:tcPr>
           <w:p>
             <w:pPr>
@@ -328,7 +328,7 @@
         </w:tc>
         <w:tc>
           <w:tcPr>
-            <w:tcW w:w="5556" w:type="dxa"/>
+            <w:tcW w:w="4315" w:type="dxa"/>
           </w:tcPr>
           <w:p>
             <w:pPr>
@@ -352,7 +352,7 @@
         </w:tc>
         <w:tc>
           <w:tcPr>
-            <w:tcW w:w="1713" w:type="dxa"/>
+            <w:tcW w:w="1952" w:type="dxa"/>
           </w:tcPr>
           <w:p>
             <w:pPr>
@@ -371,7 +371,7 @@
       <w:tr>
         <w:tc>
           <w:tcPr>
-            <w:tcW w:w="2361" w:type="dxa"/>
+            <w:tcW w:w="3363" w:type="dxa"/>
           </w:tcPr>
           <w:p>
             <w:pPr>
@@ -389,7 +389,7 @@
         </w:tc>
         <w:tc>
           <w:tcPr>
-            <w:tcW w:w="5556" w:type="dxa"/>
+            <w:tcW w:w="4315" w:type="dxa"/>
           </w:tcPr>
           <w:p>
             <w:pPr>
@@ -406,7 +406,7 @@
         </w:tc>
         <w:tc>
           <w:tcPr>
-            <w:tcW w:w="1713" w:type="dxa"/>
+            <w:tcW w:w="1952" w:type="dxa"/>
           </w:tcPr>
           <w:p>
             <w:pPr>
@@ -425,7 +425,7 @@
       <w:tr>
         <w:tc>
           <w:tcPr>
-            <w:tcW w:w="2361" w:type="dxa"/>
+            <w:tcW w:w="3363" w:type="dxa"/>
           </w:tcPr>
           <w:p>
             <w:pPr>
@@ -443,7 +443,7 @@
         </w:tc>
         <w:tc>
           <w:tcPr>
-            <w:tcW w:w="5556" w:type="dxa"/>
+            <w:tcW w:w="4315" w:type="dxa"/>
           </w:tcPr>
           <w:p>
             <w:pPr>
@@ -460,7 +460,7 @@
         </w:tc>
         <w:tc>
           <w:tcPr>
-            <w:tcW w:w="1713" w:type="dxa"/>
+            <w:tcW w:w="1952" w:type="dxa"/>
           </w:tcPr>
           <w:p>
             <w:pPr>
@@ -479,7 +479,7 @@
       <w:tr>
         <w:tc>
           <w:tcPr>
-            <w:tcW w:w="2361" w:type="dxa"/>
+            <w:tcW w:w="3363" w:type="dxa"/>
           </w:tcPr>
           <w:p>
             <w:pPr>
@@ -497,7 +497,7 @@
         </w:tc>
         <w:tc>
           <w:tcPr>
-            <w:tcW w:w="5556" w:type="dxa"/>
+            <w:tcW w:w="4315" w:type="dxa"/>
           </w:tcPr>
           <w:p>
             <w:pPr>
@@ -514,7 +514,7 @@
         </w:tc>
         <w:tc>
           <w:tcPr>
-            <w:tcW w:w="1713" w:type="dxa"/>
+            <w:tcW w:w="1952" w:type="dxa"/>
           </w:tcPr>
           <w:p>
             <w:pPr>
@@ -533,7 +533,7 @@
       <w:tr>
         <w:tc>
           <w:tcPr>
-            <w:tcW w:w="2361" w:type="dxa"/>
+            <w:tcW w:w="3363" w:type="dxa"/>
           </w:tcPr>
           <w:p>
             <w:pPr>
@@ -551,7 +551,7 @@
         </w:tc>
         <w:tc>
           <w:tcPr>
-            <w:tcW w:w="5556" w:type="dxa"/>
+            <w:tcW w:w="4315" w:type="dxa"/>
           </w:tcPr>
           <w:p>
             <w:pPr>
@@ -568,7 +568,7 @@
         </w:tc>
         <w:tc>
           <w:tcPr>
-            <w:tcW w:w="1713" w:type="dxa"/>
+            <w:tcW w:w="1952" w:type="dxa"/>
           </w:tcPr>
           <w:p>
             <w:pPr>
@@ -587,7 +587,7 @@
       <w:tr>
         <w:tc>
           <w:tcPr>
-            <w:tcW w:w="2361" w:type="dxa"/>
+            <w:tcW w:w="3363" w:type="dxa"/>
           </w:tcPr>
           <w:p>
             <w:pPr>
@@ -605,7 +605,7 @@
         </w:tc>
         <w:tc>
           <w:tcPr>
-            <w:tcW w:w="5556" w:type="dxa"/>
+            <w:tcW w:w="4315" w:type="dxa"/>
           </w:tcPr>
           <w:p>
             <w:pPr>
@@ -622,7 +622,7 @@
         </w:tc>
         <w:tc>
           <w:tcPr>
-            <w:tcW w:w="1713" w:type="dxa"/>
+            <w:tcW w:w="1952" w:type="dxa"/>
           </w:tcPr>
           <w:p>
             <w:pPr>
@@ -641,7 +641,7 @@
       <w:tr>
         <w:tc>
           <w:tcPr>
-            <w:tcW w:w="2361" w:type="dxa"/>
+            <w:tcW w:w="3363" w:type="dxa"/>
           </w:tcPr>
           <w:p>
             <w:pPr>
@@ -659,7 +659,7 @@
         </w:tc>
         <w:tc>
           <w:tcPr>
-            <w:tcW w:w="5556" w:type="dxa"/>
+            <w:tcW w:w="4315" w:type="dxa"/>
           </w:tcPr>
           <w:p>
             <w:pPr>
@@ -676,7 +676,7 @@
         </w:tc>
         <w:tc>
           <w:tcPr>
-            <w:tcW w:w="1713" w:type="dxa"/>
+            <w:tcW w:w="1952" w:type="dxa"/>
           </w:tcPr>
           <w:p>
             <w:pPr>
@@ -695,7 +695,7 @@
       <w:tr>
         <w:tc>
           <w:tcPr>
-            <w:tcW w:w="2361" w:type="dxa"/>
+            <w:tcW w:w="3363" w:type="dxa"/>
           </w:tcPr>
           <w:p>
             <w:pPr>
@@ -713,7 +713,7 @@
         </w:tc>
         <w:tc>
           <w:tcPr>
-            <w:tcW w:w="5556" w:type="dxa"/>
+            <w:tcW w:w="4315" w:type="dxa"/>
           </w:tcPr>
           <w:p>
             <w:pPr>
@@ -730,7 +730,7 @@
         </w:tc>
         <w:tc>
           <w:tcPr>
-            <w:tcW w:w="1713" w:type="dxa"/>
+            <w:tcW w:w="1952" w:type="dxa"/>
           </w:tcPr>
           <w:p>
             <w:pPr>
@@ -749,7 +749,7 @@
       <w:tr>
         <w:tc>
           <w:tcPr>
-            <w:tcW w:w="2361" w:type="dxa"/>
+            <w:tcW w:w="3363" w:type="dxa"/>
           </w:tcPr>
           <w:p>
             <w:pPr>
@@ -767,7 +767,7 @@
         </w:tc>
         <w:tc>
           <w:tcPr>
-            <w:tcW w:w="5556" w:type="dxa"/>
+            <w:tcW w:w="4315" w:type="dxa"/>
           </w:tcPr>
           <w:p>
             <w:pPr>
@@ -784,7 +784,7 @@
         </w:tc>
         <w:tc>
           <w:tcPr>
-            <w:tcW w:w="1713" w:type="dxa"/>
+            <w:tcW w:w="1952" w:type="dxa"/>
           </w:tcPr>
           <w:p>
             <w:pPr>
@@ -803,7 +803,7 @@
       <w:tr>
         <w:tc>
           <w:tcPr>
-            <w:tcW w:w="2361" w:type="dxa"/>
+            <w:tcW w:w="3363" w:type="dxa"/>
           </w:tcPr>
           <w:p>
             <w:pPr>
@@ -821,7 +821,7 @@
         </w:tc>
         <w:tc>
           <w:tcPr>
-            <w:tcW w:w="5556" w:type="dxa"/>
+            <w:tcW w:w="4315" w:type="dxa"/>
           </w:tcPr>
           <w:p>
             <w:pPr>
@@ -838,7 +838,7 @@
         </w:tc>
         <w:tc>
           <w:tcPr>
-            <w:tcW w:w="1713" w:type="dxa"/>
+            <w:tcW w:w="1952" w:type="dxa"/>
           </w:tcPr>
           <w:p>
             <w:pPr>
@@ -857,7 +857,7 @@
       <w:tr>
         <w:tc>
           <w:tcPr>
-            <w:tcW w:w="2361" w:type="dxa"/>
+            <w:tcW w:w="3363" w:type="dxa"/>
           </w:tcPr>
           <w:p>
             <w:pPr>
@@ -875,7 +875,7 @@
         </w:tc>
         <w:tc>
           <w:tcPr>
-            <w:tcW w:w="5556" w:type="dxa"/>
+            <w:tcW w:w="4315" w:type="dxa"/>
           </w:tcPr>
           <w:p>
             <w:pPr>
@@ -892,7 +892,7 @@
         </w:tc>
         <w:tc>
           <w:tcPr>
-            <w:tcW w:w="1713" w:type="dxa"/>
+            <w:tcW w:w="1952" w:type="dxa"/>
           </w:tcPr>
           <w:p>
             <w:pPr>
@@ -911,7 +911,7 @@
       <w:tr>
         <w:tc>
           <w:tcPr>
-            <w:tcW w:w="2361" w:type="dxa"/>
+            <w:tcW w:w="3363" w:type="dxa"/>
           </w:tcPr>
           <w:p>
             <w:pPr>
@@ -929,7 +929,7 @@
         </w:tc>
         <w:tc>
           <w:tcPr>
-            <w:tcW w:w="5556" w:type="dxa"/>
+            <w:tcW w:w="4315" w:type="dxa"/>
           </w:tcPr>
           <w:p>
             <w:pPr>
@@ -946,7 +946,7 @@
         </w:tc>
         <w:tc>
           <w:tcPr>
-            <w:tcW w:w="1713" w:type="dxa"/>
+            <w:tcW w:w="1952" w:type="dxa"/>
           </w:tcPr>
           <w:p>
             <w:pPr>
@@ -965,7 +965,7 @@
       <w:tr>
         <w:tc>
           <w:tcPr>
-            <w:tcW w:w="2361" w:type="dxa"/>
+            <w:tcW w:w="3363" w:type="dxa"/>
           </w:tcPr>
           <w:p>
             <w:pPr>
@@ -983,7 +983,7 @@
         </w:tc>
         <w:tc>
           <w:tcPr>
-            <w:tcW w:w="5556" w:type="dxa"/>
+            <w:tcW w:w="4315" w:type="dxa"/>
           </w:tcPr>
           <w:p>
             <w:pPr>
@@ -1000,7 +1000,7 @@
         </w:tc>
         <w:tc>
           <w:tcPr>
-            <w:tcW w:w="1713" w:type="dxa"/>
+            <w:tcW w:w="1952" w:type="dxa"/>
           </w:tcPr>
           <w:p>
             <w:pPr>
@@ -1019,7 +1019,7 @@
       <w:tr>
         <w:tc>
           <w:tcPr>
-            <w:tcW w:w="2361" w:type="dxa"/>
+            <w:tcW w:w="3363" w:type="dxa"/>
           </w:tcPr>
           <w:p>
             <w:pPr>
@@ -1037,7 +1037,7 @@
         </w:tc>
         <w:tc>
           <w:tcPr>
-            <w:tcW w:w="5556" w:type="dxa"/>
+            <w:tcW w:w="4315" w:type="dxa"/>
           </w:tcPr>
           <w:p>
             <w:pPr>
@@ -1054,7 +1054,7 @@
         </w:tc>
         <w:tc>
           <w:tcPr>
-            <w:tcW w:w="1713" w:type="dxa"/>
+            <w:tcW w:w="1952" w:type="dxa"/>
           </w:tcPr>
           <w:p>
             <w:pPr>
@@ -1073,7 +1073,7 @@
       <w:tr>
         <w:tc>
           <w:tcPr>
-            <w:tcW w:w="2361" w:type="dxa"/>
+            <w:tcW w:w="3363" w:type="dxa"/>
           </w:tcPr>
           <w:p>
             <w:pPr>
@@ -1091,7 +1091,7 @@
         </w:tc>
         <w:tc>
           <w:tcPr>
-            <w:tcW w:w="5556" w:type="dxa"/>
+            <w:tcW w:w="4315" w:type="dxa"/>
           </w:tcPr>
           <w:p>
             <w:pPr>
@@ -1108,7 +1108,7 @@
         </w:tc>
         <w:tc>
           <w:tcPr>
-            <w:tcW w:w="1713" w:type="dxa"/>
+            <w:tcW w:w="1952" w:type="dxa"/>
           </w:tcPr>
           <w:p>
             <w:pPr>
@@ -1127,7 +1127,7 @@
       <w:tr>
         <w:tc>
           <w:tcPr>
-            <w:tcW w:w="2361" w:type="dxa"/>
+            <w:tcW w:w="3363" w:type="dxa"/>
           </w:tcPr>
           <w:p>
             <w:pPr>
@@ -1145,7 +1145,7 @@
         </w:tc>
         <w:tc>
           <w:tcPr>
-            <w:tcW w:w="5556" w:type="dxa"/>
+            <w:tcW w:w="4315" w:type="dxa"/>
           </w:tcPr>
           <w:p>
             <w:pPr>
@@ -1162,7 +1162,7 @@
         </w:tc>
         <w:tc>
           <w:tcPr>
-            <w:tcW w:w="1713" w:type="dxa"/>
+            <w:tcW w:w="1952" w:type="dxa"/>
           </w:tcPr>
           <w:p>
             <w:pPr>
@@ -1181,7 +1181,7 @@
       <w:tr>
         <w:tc>
           <w:tcPr>
-            <w:tcW w:w="2361" w:type="dxa"/>
+            <w:tcW w:w="3363" w:type="dxa"/>
           </w:tcPr>
           <w:p>
             <w:pPr>
@@ -1199,7 +1199,7 @@
         </w:tc>
         <w:tc>
           <w:tcPr>
-            <w:tcW w:w="5556" w:type="dxa"/>
+            <w:tcW w:w="4315" w:type="dxa"/>
           </w:tcPr>
           <w:p>
             <w:pPr>
@@ -1216,7 +1216,7 @@
         </w:tc>
         <w:tc>
           <w:tcPr>
-            <w:tcW w:w="1713" w:type="dxa"/>
+            <w:tcW w:w="1952" w:type="dxa"/>
           </w:tcPr>
           <w:p>
             <w:pPr>

</xml_diff>

<commit_message>
Agrega el resumen ejecutivo para los socios (documento 21)
- 21-resumen-ejecutivo-socios: qué estándares escogimos, por qué son dos,
  qué documentos creamos, cuidados legales, próximos pasos y estrategia de
  venta, en Markdown, Word y PDF para imprimir.
- Índice (00) y LEEME actualizados.

Co-Authored-By: Claude Opus 5.5 <noreply@anthropic.com>
</commit_message>
<xml_diff>
--- a/Word/00-indice-familia-estandares.docx
+++ b/Word/00-indice-familia-estandares.docx
@@ -1228,6 +1228,60 @@
                 <w:sz w:val="17"/>
               </w:rPr>
               <w:t>Borrador 1.0 para revisión jurídica</w:t>
+            </w:r>
+          </w:p>
+        </w:tc>
+      </w:tr>
+      <w:tr>
+        <w:tc>
+          <w:tcPr>
+            <w:tcW w:w="3363" w:type="dxa"/>
+          </w:tcPr>
+          <w:p>
+            <w:pPr>
+              <w:pStyle w:val="Compact"/>
+              <w:spacing w:before="20" w:after="20"/>
+            </w:pPr>
+            <w:r>
+              <w:rPr>
+                <w:rFonts w:ascii="Consolas" w:hAnsi="Consolas"/>
+                <w:sz w:val="17"/>
+              </w:rPr>
+              <w:t>21-resumen-ejecutivo-socios.md</w:t>
+            </w:r>
+          </w:p>
+        </w:tc>
+        <w:tc>
+          <w:tcPr>
+            <w:tcW w:w="4315" w:type="dxa"/>
+          </w:tcPr>
+          <w:p>
+            <w:pPr>
+              <w:pStyle w:val="Compact"/>
+              <w:spacing w:before="20" w:after="20"/>
+            </w:pPr>
+            <w:r>
+              <w:rPr>
+                <w:sz w:val="17"/>
+              </w:rPr>
+              <w:t>Resumen ejecutivo para los socios: qué estándares escogimos, por qué son dos, qué documentos creamos, cuidados legales y estrategia de venta</w:t>
+            </w:r>
+          </w:p>
+        </w:tc>
+        <w:tc>
+          <w:tcPr>
+            <w:tcW w:w="1952" w:type="dxa"/>
+          </w:tcPr>
+          <w:p>
+            <w:pPr>
+              <w:pStyle w:val="Compact"/>
+              <w:spacing w:before="20" w:after="20"/>
+            </w:pPr>
+            <w:r>
+              <w:rPr>
+                <w:sz w:val="17"/>
+              </w:rPr>
+              <w:t>Versión 1.0</w:t>
             </w:r>
           </w:p>
         </w:tc>

</xml_diff>